<commit_message>
update fig to show a few more labels
</commit_message>
<xml_diff>
--- a/paper/paper.docx
+++ b/paper/paper.docx
@@ -1531,7 +1531,7 @@
         <w:t xml:space="preserve"> </w:t>
       </w:r>
       <w:r>
-        <w:t xml:space="preserve">seriation algorithm implemented as an iterative reordering procedure that arranges rows and columns to group the presences along the diagonal. This algorithm was adapted from the original Brower-Kile approach and implemented in R, the code is openly available in our research compendium at https://github.com/sophiecooper2/SignBase</w:t>
+        <w:t xml:space="preserve">seriation algorithm implemented as an iterative reordering procedure that arranges rows and columns to group the presences along the diagonal. This algorithm was adapted from the original Brower-Kile approach and implemented in R, the code is openly available in our research compendium.</w:t>
       </w:r>
     </w:p>
     <w:p>
@@ -3077,7 +3077,13 @@
               <w:pStyle w:val="ImageCaption"/>
             </w:pPr>
             <w:r>
-              <w:t xml:space="preserve">Figure 6: Observed geometric sign diversity at each site compared with expectations derived from randomised assemblages controlling for sample size. The blue expectation curve is the mean simulated diversity index per sample size. The red lines enclose a band that is the 95% confidence interval of the null distribution (no sites exceed this interval). Sites above the blue expectation curve have higher than average diversity, given their sample size.</w:t>
+              <w:t xml:space="preserve">Figure 6: Observed geometric sign diversity at each site compared with expectations derived from randomised assemblages controlling for sample size. The blue expectation curve is the mean simulated diversity index per sample size. The red lines enclose a band that is the 95% confidence interval of the null distribution (no sites exceed this interval). Sites above the blue expectation curve have higher than average diversity, given their sample size. Site names are shown for sites with a sample size of five or more; ten Aur-P1 sites and four Aur-P2 sites fall below that threshold and are drawn as unlabelled points, because their names cannot be placed legibly at this figure width. Per-site values for every site are given in S1 §</w:t>
+            </w:r>
+            <w:r>
+              <w:t xml:space="preserve">S1.12.2</w:t>
+            </w:r>
+            <w:r>
+              <w:t xml:space="preserve">.</w:t>
             </w:r>
           </w:p>
           <w:bookmarkEnd w:id="57"/>
@@ -3861,7 +3867,7 @@
       </w:r>
     </w:p>
     <w:bookmarkEnd w:id="61"/>
-    <w:bookmarkStart w:id="307" w:name="references"/>
+    <w:bookmarkStart w:id="309" w:name="references"/>
     <w:p>
       <w:pPr>
         <w:pStyle w:val="Heading1"/>
@@ -3870,7 +3876,7 @@
         <w:t xml:space="preserve">References</w:t>
       </w:r>
     </w:p>
-    <w:bookmarkStart w:id="306" w:name="refs"/>
+    <w:bookmarkStart w:id="308" w:name="refs"/>
     <w:bookmarkStart w:id="63" w:name="ref-Boyd_Silk_2020"/>
     <w:p>
       <w:pPr>
@@ -5328,7 +5334,16 @@
         <w:t xml:space="preserve">	</w:t>
       </w:r>
       <w:r>
-        <w:t xml:space="preserve">Massicotte P, South A.</w:t>
+        <w:t xml:space="preserve">Massicotte P, South A. Rnaturalearth: World map data from</w:t>
+      </w:r>
+      <w:r>
+        <w:t xml:space="preserve"> </w:t>
+      </w:r>
+      <w:r>
+        <w:t xml:space="preserve">Natural Earth</w:t>
+      </w:r>
+      <w:r>
+        <w:t xml:space="preserve">. 2026.</w:t>
       </w:r>
       <w:r>
         <w:t xml:space="preserve"> </w:t>
@@ -5338,23 +5353,11 @@
           <w:rPr>
             <w:rStyle w:val="Hyperlink"/>
           </w:rPr>
-          <w:t xml:space="preserve">Rnaturalearth: World map data from</w:t>
-        </w:r>
-        <w:r>
-          <w:rPr>
-            <w:rStyle w:val="Hyperlink"/>
-          </w:rPr>
-          <w:t xml:space="preserve"> </w:t>
-        </w:r>
-        <w:r>
-          <w:rPr>
-            <w:rStyle w:val="Hyperlink"/>
-          </w:rPr>
-          <w:t xml:space="preserve">Natural Earth</w:t>
-        </w:r>
-      </w:hyperlink>
-      <w:r>
-        <w:t xml:space="preserve">. 2026.</w:t>
+          <w:t xml:space="preserve">https://doi.org/10.32614/CRAN.package.rnaturalearth</w:t>
+        </w:r>
+      </w:hyperlink>
+      <w:r>
+        <w:t xml:space="preserve">.</w:t>
       </w:r>
     </w:p>
     <w:bookmarkEnd w:id="113"/>
@@ -5481,7 +5484,7 @@
         <w:t xml:space="preserve">	</w:t>
       </w:r>
       <w:r>
-        <w:t xml:space="preserve">Oksanen J, Simpson GL, Blanchet FG, Kindt R, Legendre P, Minchin PR, et al. Vegan: Community ecology package 2023.</w:t>
+        <w:t xml:space="preserve">Oksanen J, Simpson GL, Blanchet FG, Kindt R, Legendre P, Minchin PR, et al. Vegan: Community ecology package 2022.</w:t>
       </w:r>
       <w:r>
         <w:t xml:space="preserve"> </w:t>
@@ -5736,7 +5739,7 @@
         <w:t xml:space="preserve">	</w:t>
       </w:r>
       <w:r>
-        <w:t xml:space="preserve">Handcock MS, Hunter DR, Butts CT, Goodreau SM, Krivitsky PN, Bender-deMoll S, et al.</w:t>
+        <w:t xml:space="preserve">Handcock MS, Hunter DR, Butts CT, Goodreau SM, Krivitsky PN, Bender-deMoll S, et al. Statnet: Software tools for the statistical analysis of network data 2019.</w:t>
       </w:r>
       <w:r>
         <w:t xml:space="preserve"> </w:t>
@@ -5746,14 +5749,11 @@
           <w:rPr>
             <w:rStyle w:val="Hyperlink"/>
           </w:rPr>
-          <w:t xml:space="preserve">Statnet: Software tools for the statistical analysis of network data</w:t>
-        </w:r>
-      </w:hyperlink>
-      <w:r>
-        <w:t xml:space="preserve"> </w:t>
-      </w:r>
-      <w:r>
-        <w:t xml:space="preserve">2019.</w:t>
+          <w:t xml:space="preserve">https://doi.org/10.32614/CRAN.package.statnet</w:t>
+        </w:r>
+      </w:hyperlink>
+      <w:r>
+        <w:t xml:space="preserve">.</w:t>
       </w:r>
     </w:p>
     <w:bookmarkEnd w:id="135"/>
@@ -6928,7 +6928,7 @@
       </w:r>
     </w:p>
     <w:bookmarkEnd w:id="187"/>
-    <w:bookmarkStart w:id="188" w:name="ref-Fitzhugh_Phillips_Gjesfeld_2011"/>
+    <w:bookmarkStart w:id="189" w:name="ref-Fitzhugh_Phillips_Gjesfeld_2011"/>
     <w:p>
       <w:pPr>
         <w:pStyle w:val="Bibliography"/>
@@ -6954,9 +6954,23 @@
       <w:r>
         <w:t xml:space="preserve">. In: Whallon R, Lovis WA, Hitchcock RK, editors. Information and its role in hunter-gatherer bands, Cotsen Institute of Archaeology Press at UCLA; 2011, p. 85–116.</w:t>
       </w:r>
-    </w:p>
-    <w:bookmarkEnd w:id="188"/>
-    <w:bookmarkStart w:id="190" w:name="ref-Lovis_Donahue_2011"/>
+      <w:r>
+        <w:t xml:space="preserve"> </w:t>
+      </w:r>
+      <w:hyperlink r:id="rId188">
+        <w:r>
+          <w:rPr>
+            <w:rStyle w:val="Hyperlink"/>
+          </w:rPr>
+          <w:t xml:space="preserve">https://doi.org/10.2307/j.ctvdmwwz4.8</w:t>
+        </w:r>
+      </w:hyperlink>
+      <w:r>
+        <w:t xml:space="preserve">.</w:t>
+      </w:r>
+    </w:p>
+    <w:bookmarkEnd w:id="189"/>
+    <w:bookmarkStart w:id="191" w:name="ref-Lovis_Donahue_2011"/>
     <w:p>
       <w:pPr>
         <w:pStyle w:val="Bibliography"/>
@@ -6994,7 +7008,7 @@
       <w:r>
         <w:t xml:space="preserve"> </w:t>
       </w:r>
-      <w:hyperlink r:id="rId189">
+      <w:hyperlink r:id="rId190">
         <w:r>
           <w:rPr>
             <w:rStyle w:val="Hyperlink"/>
@@ -7006,8 +7020,8 @@
         <w:t xml:space="preserve">.</w:t>
       </w:r>
     </w:p>
-    <w:bookmarkEnd w:id="190"/>
-    <w:bookmarkStart w:id="192" w:name="ref-Hitchcock_Ebert_2011"/>
+    <w:bookmarkEnd w:id="191"/>
+    <w:bookmarkStart w:id="193" w:name="ref-Hitchcock_Ebert_2011"/>
     <w:p>
       <w:pPr>
         <w:pStyle w:val="Bibliography"/>
@@ -7045,7 +7059,7 @@
       <w:r>
         <w:t xml:space="preserve"> </w:t>
       </w:r>
-      <w:hyperlink r:id="rId191">
+      <w:hyperlink r:id="rId192">
         <w:r>
           <w:rPr>
             <w:rStyle w:val="Hyperlink"/>
@@ -7057,8 +7071,8 @@
         <w:t xml:space="preserve">.</w:t>
       </w:r>
     </w:p>
-    <w:bookmarkEnd w:id="192"/>
-    <w:bookmarkStart w:id="194" w:name="ref-Romano_Lozano_Fern2022"/>
+    <w:bookmarkEnd w:id="193"/>
+    <w:bookmarkStart w:id="195" w:name="ref-Romano_Lozano_Fern2022"/>
     <w:p>
       <w:pPr>
         <w:pStyle w:val="Bibliography"/>
@@ -7102,7 +7116,7 @@
       <w:r>
         <w:t xml:space="preserve"> </w:t>
       </w:r>
-      <w:hyperlink r:id="rId193">
+      <w:hyperlink r:id="rId194">
         <w:r>
           <w:rPr>
             <w:rStyle w:val="Hyperlink"/>
@@ -7114,8 +7128,8 @@
         <w:t xml:space="preserve">.</w:t>
       </w:r>
     </w:p>
-    <w:bookmarkEnd w:id="194"/>
-    <w:bookmarkStart w:id="196" w:name="ref-Kelly_2024"/>
+    <w:bookmarkEnd w:id="195"/>
+    <w:bookmarkStart w:id="197" w:name="ref-Kelly_2024"/>
     <w:p>
       <w:pPr>
         <w:pStyle w:val="Bibliography"/>
@@ -7156,7 +7170,7 @@
       <w:r>
         <w:t xml:space="preserve"> </w:t>
       </w:r>
-      <w:hyperlink r:id="rId195">
+      <w:hyperlink r:id="rId196">
         <w:r>
           <w:rPr>
             <w:rStyle w:val="Hyperlink"/>
@@ -7168,8 +7182,8 @@
         <w:t xml:space="preserve">.</w:t>
       </w:r>
     </w:p>
-    <w:bookmarkEnd w:id="196"/>
-    <w:bookmarkStart w:id="198" w:name="ref-Kinahan_2013"/>
+    <w:bookmarkEnd w:id="197"/>
+    <w:bookmarkStart w:id="199" w:name="ref-Kinahan_2013"/>
     <w:p>
       <w:pPr>
         <w:pStyle w:val="Bibliography"/>
@@ -7210,7 +7224,7 @@
       <w:r>
         <w:t xml:space="preserve"> </w:t>
       </w:r>
-      <w:hyperlink r:id="rId197">
+      <w:hyperlink r:id="rId198">
         <w:r>
           <w:rPr>
             <w:rStyle w:val="Hyperlink"/>
@@ -7222,8 +7236,8 @@
         <w:t xml:space="preserve">.</w:t>
       </w:r>
     </w:p>
-    <w:bookmarkEnd w:id="198"/>
-    <w:bookmarkStart w:id="200" w:name="ref-Newlander_2012"/>
+    <w:bookmarkEnd w:id="199"/>
+    <w:bookmarkStart w:id="201" w:name="ref-Newlander_2012"/>
     <w:p>
       <w:pPr>
         <w:pStyle w:val="Bibliography"/>
@@ -7243,7 +7257,7 @@
       <w:r>
         <w:t xml:space="preserve"> </w:t>
       </w:r>
-      <w:hyperlink r:id="rId199">
+      <w:hyperlink r:id="rId200">
         <w:r>
           <w:rPr>
             <w:rStyle w:val="Hyperlink"/>
@@ -7303,8 +7317,8 @@
         <w:t xml:space="preserve">. Ph.D. University of Michigan, 2012.</w:t>
       </w:r>
     </w:p>
-    <w:bookmarkEnd w:id="200"/>
-    <w:bookmarkStart w:id="202" w:name="ref-Iizuka_Ferguson_Izuho_2022"/>
+    <w:bookmarkEnd w:id="201"/>
+    <w:bookmarkStart w:id="203" w:name="ref-Iizuka_Ferguson_Izuho_2022"/>
     <w:p>
       <w:pPr>
         <w:pStyle w:val="Bibliography"/>
@@ -7357,7 +7371,7 @@
       <w:r>
         <w:t xml:space="preserve"> </w:t>
       </w:r>
-      <w:hyperlink r:id="rId201">
+      <w:hyperlink r:id="rId202">
         <w:r>
           <w:rPr>
             <w:rStyle w:val="Hyperlink"/>
@@ -7369,8 +7383,8 @@
         <w:t xml:space="preserve">.</w:t>
       </w:r>
     </w:p>
-    <w:bookmarkEnd w:id="202"/>
-    <w:bookmarkStart w:id="204" w:name="ref-conkey_agg"/>
+    <w:bookmarkEnd w:id="203"/>
+    <w:bookmarkStart w:id="205" w:name="ref-conkey_agg"/>
     <w:p>
       <w:pPr>
         <w:pStyle w:val="Bibliography"/>
@@ -7402,7 +7416,7 @@
       <w:r>
         <w:t xml:space="preserve"> </w:t>
       </w:r>
-      <w:hyperlink r:id="rId203">
+      <w:hyperlink r:id="rId204">
         <w:r>
           <w:rPr>
             <w:rStyle w:val="Hyperlink"/>
@@ -7414,8 +7428,8 @@
         <w:t xml:space="preserve">.</w:t>
       </w:r>
     </w:p>
-    <w:bookmarkEnd w:id="204"/>
-    <w:bookmarkStart w:id="206" w:name="ref-Maher_Conkey_2019"/>
+    <w:bookmarkEnd w:id="205"/>
+    <w:bookmarkStart w:id="207" w:name="ref-Maher_Conkey_2019"/>
     <w:p>
       <w:pPr>
         <w:pStyle w:val="Bibliography"/>
@@ -7468,7 +7482,7 @@
       <w:r>
         <w:t xml:space="preserve"> </w:t>
       </w:r>
-      <w:hyperlink r:id="rId205">
+      <w:hyperlink r:id="rId206">
         <w:r>
           <w:rPr>
             <w:rStyle w:val="Hyperlink"/>
@@ -7480,8 +7494,8 @@
         <w:t xml:space="preserve">.</w:t>
       </w:r>
     </w:p>
-    <w:bookmarkEnd w:id="206"/>
-    <w:bookmarkStart w:id="208" w:name="ref-bahn1982inter"/>
+    <w:bookmarkEnd w:id="207"/>
+    <w:bookmarkStart w:id="209" w:name="ref-bahn1982inter"/>
     <w:p>
       <w:pPr>
         <w:pStyle w:val="Bibliography"/>
@@ -7522,7 +7536,7 @@
       <w:r>
         <w:t xml:space="preserve"> </w:t>
       </w:r>
-      <w:hyperlink r:id="rId207">
+      <w:hyperlink r:id="rId208">
         <w:r>
           <w:rPr>
             <w:rStyle w:val="Hyperlink"/>
@@ -7534,8 +7548,8 @@
         <w:t xml:space="preserve">.</w:t>
       </w:r>
     </w:p>
-    <w:bookmarkEnd w:id="208"/>
-    <w:bookmarkStart w:id="210" w:name="ref-Bourdier_2013"/>
+    <w:bookmarkEnd w:id="209"/>
+    <w:bookmarkStart w:id="211" w:name="ref-Bourdier_2013"/>
     <w:p>
       <w:pPr>
         <w:pStyle w:val="Bibliography"/>
@@ -7591,7 +7605,7 @@
       <w:r>
         <w:t xml:space="preserve"> </w:t>
       </w:r>
-      <w:hyperlink r:id="rId209">
+      <w:hyperlink r:id="rId210">
         <w:r>
           <w:rPr>
             <w:rStyle w:val="Hyperlink"/>
@@ -7603,8 +7617,8 @@
         <w:t xml:space="preserve">.</w:t>
       </w:r>
     </w:p>
-    <w:bookmarkEnd w:id="210"/>
-    <w:bookmarkStart w:id="212" w:name="ref-Svoboda_2013"/>
+    <w:bookmarkEnd w:id="211"/>
+    <w:bookmarkStart w:id="213" w:name="ref-Svoboda_2013"/>
     <w:p>
       <w:pPr>
         <w:pStyle w:val="Bibliography"/>
@@ -7636,7 +7650,7 @@
       <w:r>
         <w:t xml:space="preserve"> </w:t>
       </w:r>
-      <w:hyperlink r:id="rId211">
+      <w:hyperlink r:id="rId212">
         <w:r>
           <w:rPr>
             <w:rStyle w:val="Hyperlink"/>
@@ -7648,8 +7662,8 @@
         <w:t xml:space="preserve">.</w:t>
       </w:r>
     </w:p>
-    <w:bookmarkEnd w:id="212"/>
-    <w:bookmarkStart w:id="214" w:name="ref-white1992rethinking"/>
+    <w:bookmarkEnd w:id="213"/>
+    <w:bookmarkStart w:id="215" w:name="ref-white1992rethinking"/>
     <w:p>
       <w:pPr>
         <w:pStyle w:val="Bibliography"/>
@@ -7681,7 +7695,7 @@
       <w:r>
         <w:t xml:space="preserve"> </w:t>
       </w:r>
-      <w:hyperlink r:id="rId213">
+      <w:hyperlink r:id="rId214">
         <w:r>
           <w:rPr>
             <w:rStyle w:val="Hyperlink"/>
@@ -7693,8 +7707,8 @@
         <w:t xml:space="preserve">.</w:t>
       </w:r>
     </w:p>
-    <w:bookmarkEnd w:id="214"/>
-    <w:bookmarkStart w:id="215" w:name="X79d7c52b9cdbe72fc1b94e51c6ee6057d0c4a50"/>
+    <w:bookmarkEnd w:id="215"/>
+    <w:bookmarkStart w:id="216" w:name="X79d7c52b9cdbe72fc1b94e51c6ee6057d0c4a50"/>
     <w:p>
       <w:pPr>
         <w:pStyle w:val="Bibliography"/>
@@ -7736,8 +7750,8 @@
         <w:t xml:space="preserve">household, SUNY Press; 2010, p. 235–44.</w:t>
       </w:r>
     </w:p>
-    <w:bookmarkEnd w:id="215"/>
-    <w:bookmarkStart w:id="217" w:name="ref-montet-white1994"/>
+    <w:bookmarkEnd w:id="216"/>
+    <w:bookmarkStart w:id="218" w:name="ref-montet-white1994"/>
     <w:p>
       <w:pPr>
         <w:pStyle w:val="Bibliography"/>
@@ -7778,7 +7792,7 @@
       <w:r>
         <w:t xml:space="preserve"> </w:t>
       </w:r>
-      <w:hyperlink r:id="rId216">
+      <w:hyperlink r:id="rId217">
         <w:r>
           <w:rPr>
             <w:rStyle w:val="Hyperlink"/>
@@ -7790,8 +7804,8 @@
         <w:t xml:space="preserve">.</w:t>
       </w:r>
     </w:p>
-    <w:bookmarkEnd w:id="217"/>
-    <w:bookmarkStart w:id="219" w:name="ref-Frerebeau_2025"/>
+    <w:bookmarkEnd w:id="218"/>
+    <w:bookmarkStart w:id="220" w:name="ref-Frerebeau_2025"/>
     <w:p>
       <w:pPr>
         <w:pStyle w:val="Bibliography"/>
@@ -7811,7 +7825,7 @@
       <w:r>
         <w:t xml:space="preserve"> </w:t>
       </w:r>
-      <w:hyperlink r:id="rId218">
+      <w:hyperlink r:id="rId219">
         <w:r>
           <w:rPr>
             <w:rStyle w:val="Hyperlink"/>
@@ -7823,8 +7837,8 @@
         <w:t xml:space="preserve">.</w:t>
       </w:r>
     </w:p>
-    <w:bookmarkEnd w:id="219"/>
-    <w:bookmarkStart w:id="221" w:name="ref-Kintigh_1984"/>
+    <w:bookmarkEnd w:id="220"/>
+    <w:bookmarkStart w:id="222" w:name="ref-Kintigh_1984"/>
     <w:p>
       <w:pPr>
         <w:pStyle w:val="Bibliography"/>
@@ -7844,7 +7858,7 @@
       <w:r>
         <w:t xml:space="preserve"> </w:t>
       </w:r>
-      <w:hyperlink r:id="rId220">
+      <w:hyperlink r:id="rId221">
         <w:r>
           <w:rPr>
             <w:rStyle w:val="Hyperlink"/>
@@ -7856,8 +7870,8 @@
         <w:t xml:space="preserve">.</w:t>
       </w:r>
     </w:p>
-    <w:bookmarkEnd w:id="221"/>
-    <w:bookmarkStart w:id="223" w:name="X8c17deb08b87fbfa26556dda630532ff62c8bd1"/>
+    <w:bookmarkEnd w:id="222"/>
+    <w:bookmarkStart w:id="224" w:name="X8c17deb08b87fbfa26556dda630532ff62c8bd1"/>
     <w:p>
       <w:pPr>
         <w:pStyle w:val="Bibliography"/>
@@ -7898,7 +7912,7 @@
       <w:r>
         <w:t xml:space="preserve"> </w:t>
       </w:r>
-      <w:hyperlink r:id="rId222">
+      <w:hyperlink r:id="rId223">
         <w:r>
           <w:rPr>
             <w:rStyle w:val="Hyperlink"/>
@@ -7910,8 +7924,8 @@
         <w:t xml:space="preserve">.</w:t>
       </w:r>
     </w:p>
-    <w:bookmarkEnd w:id="223"/>
-    <w:bookmarkStart w:id="225" w:name="ref-smith1992Design"/>
+    <w:bookmarkEnd w:id="224"/>
+    <w:bookmarkStart w:id="226" w:name="ref-smith1992Design"/>
     <w:p>
       <w:pPr>
         <w:pStyle w:val="Bibliography"/>
@@ -7941,12 +7955,12 @@
         <w:t xml:space="preserve">Australia</w:t>
       </w:r>
       <w:r>
-        <w:t xml:space="preserve">. Australian Archaeology 1992:51.</w:t>
-      </w:r>
-      <w:r>
-        <w:t xml:space="preserve"> </w:t>
-      </w:r>
-      <w:hyperlink r:id="rId224">
+        <w:t xml:space="preserve">. Australian Archaeology 1992;34:51.</w:t>
+      </w:r>
+      <w:r>
+        <w:t xml:space="preserve"> </w:t>
+      </w:r>
+      <w:hyperlink r:id="rId225">
         <w:r>
           <w:rPr>
             <w:rStyle w:val="Hyperlink"/>
@@ -7958,8 +7972,8 @@
         <w:t xml:space="preserve">.</w:t>
       </w:r>
     </w:p>
-    <w:bookmarkEnd w:id="225"/>
-    <w:bookmarkStart w:id="226" w:name="ref-hays1993symbol"/>
+    <w:bookmarkEnd w:id="226"/>
+    <w:bookmarkStart w:id="228" w:name="ref-hays1993symbol"/>
     <w:p>
       <w:pPr>
         <w:pStyle w:val="Bibliography"/>
@@ -7976,9 +7990,23 @@
       <w:r>
         <w:t xml:space="preserve">Hays KA. When is a symbol archaeologically meaningful? Meaning, function, and prehistoric visual arts. In: Yoffee N, Sherratt A, editors. Archaeological theory: Who sets the agenda?, Cambridge University Press; 1993, p. 81–92.</w:t>
       </w:r>
-    </w:p>
-    <w:bookmarkEnd w:id="226"/>
-    <w:bookmarkStart w:id="228" w:name="ref-McDonald_Veth_Lilley_2006"/>
+      <w:r>
+        <w:t xml:space="preserve"> </w:t>
+      </w:r>
+      <w:hyperlink r:id="rId227">
+        <w:r>
+          <w:rPr>
+            <w:rStyle w:val="Hyperlink"/>
+          </w:rPr>
+          <w:t xml:space="preserve">https://doi.org/10.1017/cbo9780511720277.008</w:t>
+        </w:r>
+      </w:hyperlink>
+      <w:r>
+        <w:t xml:space="preserve">.</w:t>
+      </w:r>
+    </w:p>
+    <w:bookmarkEnd w:id="228"/>
+    <w:bookmarkStart w:id="230" w:name="ref-McDonald_Veth_Lilley_2006"/>
     <w:p>
       <w:pPr>
         <w:pStyle w:val="Bibliography"/>
@@ -8040,7 +8068,7 @@
       <w:r>
         <w:t xml:space="preserve"> </w:t>
       </w:r>
-      <w:hyperlink r:id="rId227">
+      <w:hyperlink r:id="rId229">
         <w:r>
           <w:rPr>
             <w:rStyle w:val="Hyperlink"/>
@@ -8052,8 +8080,8 @@
         <w:t xml:space="preserve">.</w:t>
       </w:r>
     </w:p>
-    <w:bookmarkEnd w:id="228"/>
-    <w:bookmarkStart w:id="230" w:name="ref-Lourandos_1985"/>
+    <w:bookmarkEnd w:id="230"/>
+    <w:bookmarkStart w:id="232" w:name="ref-Lourandos_1985"/>
     <w:p>
       <w:pPr>
         <w:pStyle w:val="Bibliography"/>
@@ -8085,7 +8113,7 @@
       <w:r>
         <w:t xml:space="preserve"> </w:t>
       </w:r>
-      <w:hyperlink r:id="rId229">
+      <w:hyperlink r:id="rId231">
         <w:r>
           <w:rPr>
             <w:rStyle w:val="Hyperlink"/>
@@ -8097,8 +8125,8 @@
         <w:t xml:space="preserve">.</w:t>
       </w:r>
     </w:p>
-    <w:bookmarkEnd w:id="230"/>
-    <w:bookmarkStart w:id="232" w:name="ref-barton_clark_cohen1994"/>
+    <w:bookmarkEnd w:id="232"/>
+    <w:bookmarkStart w:id="234" w:name="ref-barton_clark_cohen1994"/>
     <w:p>
       <w:pPr>
         <w:pStyle w:val="Bibliography"/>
@@ -8139,7 +8167,7 @@
       <w:r>
         <w:t xml:space="preserve"> </w:t>
       </w:r>
-      <w:hyperlink r:id="rId231">
+      <w:hyperlink r:id="rId233">
         <w:r>
           <w:rPr>
             <w:rStyle w:val="Hyperlink"/>
@@ -8151,8 +8179,8 @@
         <w:t xml:space="preserve">.</w:t>
       </w:r>
     </w:p>
-    <w:bookmarkEnd w:id="232"/>
-    <w:bookmarkStart w:id="234" w:name="ref-mcdonald2012social"/>
+    <w:bookmarkEnd w:id="234"/>
+    <w:bookmarkStart w:id="236" w:name="ref-mcdonald2012social"/>
     <w:p>
       <w:pPr>
         <w:pStyle w:val="Bibliography"/>
@@ -8181,7 +8209,7 @@
       <w:r>
         <w:t xml:space="preserve"> </w:t>
       </w:r>
-      <w:hyperlink r:id="rId233">
+      <w:hyperlink r:id="rId235">
         <w:r>
           <w:rPr>
             <w:rStyle w:val="Hyperlink"/>
@@ -8193,8 +8221,8 @@
         <w:t xml:space="preserve">.</w:t>
       </w:r>
     </w:p>
-    <w:bookmarkEnd w:id="234"/>
-    <w:bookmarkStart w:id="236" w:name="ref-bernardini2005reconsidering"/>
+    <w:bookmarkEnd w:id="236"/>
+    <w:bookmarkStart w:id="238" w:name="ref-bernardini2005reconsidering"/>
     <w:p>
       <w:pPr>
         <w:pStyle w:val="Bibliography"/>
@@ -8223,7 +8251,7 @@
       <w:r>
         <w:t xml:space="preserve"> </w:t>
       </w:r>
-      <w:hyperlink r:id="rId235">
+      <w:hyperlink r:id="rId237">
         <w:r>
           <w:rPr>
             <w:rStyle w:val="Hyperlink"/>
@@ -8235,8 +8263,8 @@
         <w:t xml:space="preserve">.</w:t>
       </w:r>
     </w:p>
-    <w:bookmarkEnd w:id="236"/>
-    <w:bookmarkStart w:id="238" w:name="ref-wiessner1984reconsidering"/>
+    <w:bookmarkEnd w:id="238"/>
+    <w:bookmarkStart w:id="240" w:name="ref-wiessner1984reconsidering"/>
     <w:p>
       <w:pPr>
         <w:pStyle w:val="Bibliography"/>
@@ -8265,7 +8293,7 @@
       <w:r>
         <w:t xml:space="preserve"> </w:t>
       </w:r>
-      <w:hyperlink r:id="rId237">
+      <w:hyperlink r:id="rId239">
         <w:r>
           <w:rPr>
             <w:rStyle w:val="Hyperlink"/>
@@ -8277,8 +8305,8 @@
         <w:t xml:space="preserve">.</w:t>
       </w:r>
     </w:p>
-    <w:bookmarkEnd w:id="238"/>
-    <w:bookmarkStart w:id="240" w:name="ref-smith1992"/>
+    <w:bookmarkEnd w:id="240"/>
+    <w:bookmarkStart w:id="242" w:name="ref-smith1992"/>
     <w:p>
       <w:pPr>
         <w:pStyle w:val="Bibliography"/>
@@ -8319,7 +8347,7 @@
       <w:r>
         <w:t xml:space="preserve"> </w:t>
       </w:r>
-      <w:hyperlink r:id="rId239">
+      <w:hyperlink r:id="rId241">
         <w:r>
           <w:rPr>
             <w:rStyle w:val="Hyperlink"/>
@@ -8331,8 +8359,8 @@
         <w:t xml:space="preserve">.</w:t>
       </w:r>
     </w:p>
-    <w:bookmarkEnd w:id="240"/>
-    <w:bookmarkStart w:id="242" w:name="X4fed35d53d406ce17aea32f9d6f163fcb563519"/>
+    <w:bookmarkEnd w:id="242"/>
+    <w:bookmarkStart w:id="244" w:name="X4fed35d53d406ce17aea32f9d6f163fcb563519"/>
     <w:p>
       <w:pPr>
         <w:pStyle w:val="Bibliography"/>
@@ -8373,7 +8401,7 @@
       <w:r>
         <w:t xml:space="preserve"> </w:t>
       </w:r>
-      <w:hyperlink r:id="rId241">
+      <w:hyperlink r:id="rId243">
         <w:r>
           <w:rPr>
             <w:rStyle w:val="Hyperlink"/>
@@ -8385,8 +8413,8 @@
         <w:t xml:space="preserve">.</w:t>
       </w:r>
     </w:p>
-    <w:bookmarkEnd w:id="242"/>
-    <w:bookmarkStart w:id="243" w:name="ref-Cavalli_Sforza_Feldman_1981"/>
+    <w:bookmarkEnd w:id="244"/>
+    <w:bookmarkStart w:id="245" w:name="ref-Cavalli_Sforza_Feldman_1981"/>
     <w:p>
       <w:pPr>
         <w:pStyle w:val="Bibliography"/>
@@ -8404,8 +8432,8 @@
         <w:t xml:space="preserve">Cavalli-Sforza L, Feldman MW. Cultural transmission and evolution: A quantitative approach. Princeton University Press; 1981.</w:t>
       </w:r>
     </w:p>
-    <w:bookmarkEnd w:id="243"/>
-    <w:bookmarkStart w:id="244" w:name="ref-Boyd_Richerson_1985"/>
+    <w:bookmarkEnd w:id="245"/>
+    <w:bookmarkStart w:id="246" w:name="ref-Boyd_Richerson_1985"/>
     <w:p>
       <w:pPr>
         <w:pStyle w:val="Bibliography"/>
@@ -8423,8 +8451,8 @@
         <w:t xml:space="preserve">Boyd R, Richerson PJ. Culture and the evolutionary process. University of Chicago Press; 1985.</w:t>
       </w:r>
     </w:p>
-    <w:bookmarkEnd w:id="244"/>
-    <w:bookmarkStart w:id="245" w:name="ref-Richerson_Boyd_2005"/>
+    <w:bookmarkEnd w:id="246"/>
+    <w:bookmarkStart w:id="247" w:name="ref-Richerson_Boyd_2005"/>
     <w:p>
       <w:pPr>
         <w:pStyle w:val="Bibliography"/>
@@ -8442,8 +8470,8 @@
         <w:t xml:space="preserve">Richerson PJ, Boyd R. Not by genes alone: How culture transformed human evolution. University of Chicago Press; 2005.</w:t>
       </w:r>
     </w:p>
-    <w:bookmarkEnd w:id="245"/>
-    <w:bookmarkStart w:id="247" w:name="ref-Henrich_2004"/>
+    <w:bookmarkEnd w:id="247"/>
+    <w:bookmarkStart w:id="249" w:name="ref-Henrich_2004"/>
     <w:p>
       <w:pPr>
         <w:pStyle w:val="Bibliography"/>
@@ -8469,7 +8497,7 @@
       <w:r>
         <w:t xml:space="preserve"> </w:t>
       </w:r>
-      <w:hyperlink r:id="rId246">
+      <w:hyperlink r:id="rId248">
         <w:r>
           <w:rPr>
             <w:rStyle w:val="Hyperlink"/>
@@ -8481,8 +8509,8 @@
         <w:t xml:space="preserve">.</w:t>
       </w:r>
     </w:p>
-    <w:bookmarkEnd w:id="247"/>
-    <w:bookmarkStart w:id="249" w:name="ref-Migliano_2020"/>
+    <w:bookmarkEnd w:id="249"/>
+    <w:bookmarkStart w:id="251" w:name="ref-Migliano_2020"/>
     <w:p>
       <w:pPr>
         <w:pStyle w:val="Bibliography"/>
@@ -8502,7 +8530,7 @@
       <w:r>
         <w:t xml:space="preserve"> </w:t>
       </w:r>
-      <w:hyperlink r:id="rId248">
+      <w:hyperlink r:id="rId250">
         <w:r>
           <w:rPr>
             <w:rStyle w:val="Hyperlink"/>
@@ -8514,8 +8542,8 @@
         <w:t xml:space="preserve">.</w:t>
       </w:r>
     </w:p>
-    <w:bookmarkEnd w:id="249"/>
-    <w:bookmarkStart w:id="251" w:name="ref-Romano_Lozano_2020"/>
+    <w:bookmarkEnd w:id="251"/>
+    <w:bookmarkStart w:id="253" w:name="ref-Romano_Lozano_2020"/>
     <w:p>
       <w:pPr>
         <w:pStyle w:val="Bibliography"/>
@@ -8535,7 +8563,7 @@
       <w:r>
         <w:t xml:space="preserve"> </w:t>
       </w:r>
-      <w:hyperlink r:id="rId250">
+      <w:hyperlink r:id="rId252">
         <w:r>
           <w:rPr>
             <w:rStyle w:val="Hyperlink"/>
@@ -8547,8 +8575,8 @@
         <w:t xml:space="preserve">.</w:t>
       </w:r>
     </w:p>
-    <w:bookmarkEnd w:id="251"/>
-    <w:bookmarkStart w:id="253" w:name="ref-Buchanan_Hamilton_2023"/>
+    <w:bookmarkEnd w:id="253"/>
+    <w:bookmarkStart w:id="255" w:name="ref-Buchanan_Hamilton_2023"/>
     <w:p>
       <w:pPr>
         <w:pStyle w:val="Bibliography"/>
@@ -8568,7 +8596,7 @@
       <w:r>
         <w:t xml:space="preserve"> </w:t>
       </w:r>
-      <w:hyperlink r:id="rId252">
+      <w:hyperlink r:id="rId254">
         <w:r>
           <w:rPr>
             <w:rStyle w:val="Hyperlink"/>
@@ -8580,8 +8608,8 @@
         <w:t xml:space="preserve">.</w:t>
       </w:r>
     </w:p>
-    <w:bookmarkEnd w:id="253"/>
-    <w:bookmarkStart w:id="255" w:name="ref-CucartMora_2022"/>
+    <w:bookmarkEnd w:id="255"/>
+    <w:bookmarkStart w:id="257" w:name="ref-CucartMora_2022"/>
     <w:p>
       <w:pPr>
         <w:pStyle w:val="Bibliography"/>
@@ -8626,12 +8654,12 @@
         <w:t xml:space="preserve"> </w:t>
       </w:r>
       <w:r>
-        <w:t xml:space="preserve">using ornaments. Archaeological and Anthropological Sciences 2022;14.</w:t>
-      </w:r>
-      <w:r>
-        <w:t xml:space="preserve"> </w:t>
-      </w:r>
-      <w:hyperlink r:id="rId254">
+        <w:t xml:space="preserve">using ornaments. Archaeological and Anthropological Sciences 2022;14:174.</w:t>
+      </w:r>
+      <w:r>
+        <w:t xml:space="preserve"> </w:t>
+      </w:r>
+      <w:hyperlink r:id="rId256">
         <w:r>
           <w:rPr>
             <w:rStyle w:val="Hyperlink"/>
@@ -8643,8 +8671,8 @@
         <w:t xml:space="preserve">.</w:t>
       </w:r>
     </w:p>
-    <w:bookmarkEnd w:id="255"/>
-    <w:bookmarkStart w:id="257" w:name="ref-Eerkens_Lipo_2005"/>
+    <w:bookmarkEnd w:id="257"/>
+    <w:bookmarkStart w:id="259" w:name="ref-Eerkens_Lipo_2005"/>
     <w:p>
       <w:pPr>
         <w:pStyle w:val="Bibliography"/>
@@ -8664,7 +8692,7 @@
       <w:r>
         <w:t xml:space="preserve"> </w:t>
       </w:r>
-      <w:hyperlink r:id="rId256">
+      <w:hyperlink r:id="rId258">
         <w:r>
           <w:rPr>
             <w:rStyle w:val="Hyperlink"/>
@@ -8676,8 +8704,8 @@
         <w:t xml:space="preserve">.</w:t>
       </w:r>
     </w:p>
-    <w:bookmarkEnd w:id="257"/>
-    <w:bookmarkStart w:id="259" w:name="ref-Intxaurbe_2026"/>
+    <w:bookmarkEnd w:id="259"/>
+    <w:bookmarkStart w:id="261" w:name="ref-Intxaurbe_2026"/>
     <w:p>
       <w:pPr>
         <w:pStyle w:val="Bibliography"/>
@@ -8715,7 +8743,7 @@
       <w:r>
         <w:t xml:space="preserve"> </w:t>
       </w:r>
-      <w:hyperlink r:id="rId258">
+      <w:hyperlink r:id="rId260">
         <w:r>
           <w:rPr>
             <w:rStyle w:val="Hyperlink"/>
@@ -8727,8 +8755,8 @@
         <w:t xml:space="preserve">.</w:t>
       </w:r>
     </w:p>
-    <w:bookmarkEnd w:id="259"/>
-    <w:bookmarkStart w:id="261" w:name="ref-Bentz_Dutkiewicz_2026"/>
+    <w:bookmarkEnd w:id="261"/>
+    <w:bookmarkStart w:id="263" w:name="ref-Bentz_Dutkiewicz_2026"/>
     <w:p>
       <w:pPr>
         <w:pStyle w:val="Bibliography"/>
@@ -8748,7 +8776,7 @@
       <w:r>
         <w:t xml:space="preserve"> </w:t>
       </w:r>
-      <w:hyperlink r:id="rId260">
+      <w:hyperlink r:id="rId262">
         <w:r>
           <w:rPr>
             <w:rStyle w:val="Hyperlink"/>
@@ -8760,8 +8788,8 @@
         <w:t xml:space="preserve">.</w:t>
       </w:r>
     </w:p>
-    <w:bookmarkEnd w:id="261"/>
-    <w:bookmarkStart w:id="263" w:name="ref-Bacon_2023"/>
+    <w:bookmarkEnd w:id="263"/>
+    <w:bookmarkStart w:id="265" w:name="ref-Bacon_2023"/>
     <w:p>
       <w:pPr>
         <w:pStyle w:val="Bibliography"/>
@@ -8793,7 +8821,7 @@
       <w:r>
         <w:t xml:space="preserve"> </w:t>
       </w:r>
-      <w:hyperlink r:id="rId262">
+      <w:hyperlink r:id="rId264">
         <w:r>
           <w:rPr>
             <w:rStyle w:val="Hyperlink"/>
@@ -8805,8 +8833,8 @@
         <w:t xml:space="preserve">.</w:t>
       </w:r>
     </w:p>
-    <w:bookmarkEnd w:id="263"/>
-    <w:bookmarkStart w:id="265" w:name="Xa4990169aeb885a690070ab4fd90972c31994f8"/>
+    <w:bookmarkEnd w:id="265"/>
+    <w:bookmarkStart w:id="267" w:name="Xa4990169aeb885a690070ab4fd90972c31994f8"/>
     <w:p>
       <w:pPr>
         <w:pStyle w:val="Bibliography"/>
@@ -8838,7 +8866,7 @@
       <w:r>
         <w:t xml:space="preserve"> </w:t>
       </w:r>
-      <w:hyperlink r:id="rId264">
+      <w:hyperlink r:id="rId266">
         <w:r>
           <w:rPr>
             <w:rStyle w:val="Hyperlink"/>
@@ -8850,8 +8878,8 @@
         <w:t xml:space="preserve">.</w:t>
       </w:r>
     </w:p>
-    <w:bookmarkEnd w:id="265"/>
-    <w:bookmarkStart w:id="267" w:name="X8ea620419c64d551554c48b7075c9934881930b"/>
+    <w:bookmarkEnd w:id="267"/>
+    <w:bookmarkStart w:id="269" w:name="X8ea620419c64d551554c48b7075c9934881930b"/>
     <w:p>
       <w:pPr>
         <w:pStyle w:val="Bibliography"/>
@@ -8907,7 +8935,7 @@
       <w:r>
         <w:t xml:space="preserve"> </w:t>
       </w:r>
-      <w:hyperlink r:id="rId266">
+      <w:hyperlink r:id="rId268">
         <w:r>
           <w:rPr>
             <w:rStyle w:val="Hyperlink"/>
@@ -8919,8 +8947,8 @@
         <w:t xml:space="preserve">.</w:t>
       </w:r>
     </w:p>
-    <w:bookmarkEnd w:id="267"/>
-    <w:bookmarkStart w:id="269" w:name="ref-Magli_2024"/>
+    <w:bookmarkEnd w:id="269"/>
+    <w:bookmarkStart w:id="271" w:name="ref-Magli_2024"/>
     <w:p>
       <w:pPr>
         <w:pStyle w:val="Bibliography"/>
@@ -8952,7 +8980,7 @@
       <w:r>
         <w:t xml:space="preserve"> </w:t>
       </w:r>
-      <w:hyperlink r:id="rId268">
+      <w:hyperlink r:id="rId270">
         <w:r>
           <w:rPr>
             <w:rStyle w:val="Hyperlink"/>
@@ -8964,8 +8992,8 @@
         <w:t xml:space="preserve">.</w:t>
       </w:r>
     </w:p>
-    <w:bookmarkEnd w:id="269"/>
-    <w:bookmarkStart w:id="271" w:name="ref-Nowell_2024_evidence"/>
+    <w:bookmarkEnd w:id="271"/>
+    <w:bookmarkStart w:id="273" w:name="ref-Nowell_2024_evidence"/>
     <w:p>
       <w:pPr>
         <w:pStyle w:val="Bibliography"/>
@@ -8997,7 +9025,7 @@
       <w:r>
         <w:t xml:space="preserve"> </w:t>
       </w:r>
-      <w:hyperlink r:id="rId270">
+      <w:hyperlink r:id="rId272">
         <w:r>
           <w:rPr>
             <w:rStyle w:val="Hyperlink"/>
@@ -9009,8 +9037,8 @@
         <w:t xml:space="preserve">.</w:t>
       </w:r>
     </w:p>
-    <w:bookmarkEnd w:id="271"/>
-    <w:bookmarkStart w:id="273" w:name="ref-Horiuchi_Takakura_2019"/>
+    <w:bookmarkEnd w:id="273"/>
+    <w:bookmarkStart w:id="275" w:name="ref-Horiuchi_Takakura_2019"/>
     <w:p>
       <w:pPr>
         <w:pStyle w:val="Bibliography"/>
@@ -9069,7 +9097,7 @@
       <w:r>
         <w:t xml:space="preserve"> </w:t>
       </w:r>
-      <w:hyperlink r:id="rId272">
+      <w:hyperlink r:id="rId274">
         <w:r>
           <w:rPr>
             <w:rStyle w:val="Hyperlink"/>
@@ -9081,8 +9109,8 @@
         <w:t xml:space="preserve">.</w:t>
       </w:r>
     </w:p>
-    <w:bookmarkEnd w:id="273"/>
-    <w:bookmarkStart w:id="274" w:name="ref-Rogers_2018"/>
+    <w:bookmarkEnd w:id="275"/>
+    <w:bookmarkStart w:id="276" w:name="ref-Rogers_2018"/>
     <w:p>
       <w:pPr>
         <w:pStyle w:val="Bibliography"/>
@@ -9130,8 +9158,8 @@
         <w:t xml:space="preserve">: An analysis of marine shell ornament distribution. Master’s thesis. University of Victoria, 2018.</w:t>
       </w:r>
     </w:p>
-    <w:bookmarkEnd w:id="274"/>
-    <w:bookmarkStart w:id="276" w:name="X94f875be1b7e5d23641daff5d53857bec24e739"/>
+    <w:bookmarkEnd w:id="276"/>
+    <w:bookmarkStart w:id="278" w:name="X94f875be1b7e5d23641daff5d53857bec24e739"/>
     <w:p>
       <w:pPr>
         <w:pStyle w:val="Bibliography"/>
@@ -9193,7 +9221,7 @@
       <w:r>
         <w:t xml:space="preserve"> </w:t>
       </w:r>
-      <w:hyperlink r:id="rId275">
+      <w:hyperlink r:id="rId277">
         <w:r>
           <w:rPr>
             <w:rStyle w:val="Hyperlink"/>
@@ -9205,8 +9233,8 @@
         <w:t xml:space="preserve">.</w:t>
       </w:r>
     </w:p>
-    <w:bookmarkEnd w:id="276"/>
-    <w:bookmarkStart w:id="278" w:name="ref-Gamble_1982"/>
+    <w:bookmarkEnd w:id="278"/>
+    <w:bookmarkStart w:id="280" w:name="ref-Gamble_1982"/>
     <w:p>
       <w:pPr>
         <w:pStyle w:val="Bibliography"/>
@@ -9238,7 +9266,7 @@
       <w:r>
         <w:t xml:space="preserve"> </w:t>
       </w:r>
-      <w:hyperlink r:id="rId277">
+      <w:hyperlink r:id="rId279">
         <w:r>
           <w:rPr>
             <w:rStyle w:val="Hyperlink"/>
@@ -9250,8 +9278,8 @@
         <w:t xml:space="preserve">.</w:t>
       </w:r>
     </w:p>
-    <w:bookmarkEnd w:id="278"/>
-    <w:bookmarkStart w:id="280" w:name="Xba346573845225b1b1d5ef358e2fea0d893a789"/>
+    <w:bookmarkEnd w:id="280"/>
+    <w:bookmarkStart w:id="282" w:name="Xba346573845225b1b1d5ef358e2fea0d893a789"/>
     <w:p>
       <w:pPr>
         <w:pStyle w:val="Bibliography"/>
@@ -9295,7 +9323,7 @@
       <w:r>
         <w:t xml:space="preserve"> </w:t>
       </w:r>
-      <w:hyperlink r:id="rId279">
+      <w:hyperlink r:id="rId281">
         <w:r>
           <w:rPr>
             <w:rStyle w:val="Hyperlink"/>
@@ -9307,8 +9335,8 @@
         <w:t xml:space="preserve">.</w:t>
       </w:r>
     </w:p>
-    <w:bookmarkEnd w:id="280"/>
-    <w:bookmarkStart w:id="282" w:name="ref-Creanza_Kolodny_Feldman_2017"/>
+    <w:bookmarkEnd w:id="282"/>
+    <w:bookmarkStart w:id="284" w:name="ref-Creanza_Kolodny_Feldman_2017"/>
     <w:p>
       <w:pPr>
         <w:pStyle w:val="Bibliography"/>
@@ -9328,7 +9356,7 @@
       <w:r>
         <w:t xml:space="preserve"> </w:t>
       </w:r>
-      <w:hyperlink r:id="rId281">
+      <w:hyperlink r:id="rId283">
         <w:r>
           <w:rPr>
             <w:rStyle w:val="Hyperlink"/>
@@ -9340,8 +9368,8 @@
         <w:t xml:space="preserve">.</w:t>
       </w:r>
     </w:p>
-    <w:bookmarkEnd w:id="282"/>
-    <w:bookmarkStart w:id="284" w:name="ref-Cullen_1996"/>
+    <w:bookmarkEnd w:id="284"/>
+    <w:bookmarkStart w:id="286" w:name="ref-Cullen_1996"/>
     <w:p>
       <w:pPr>
         <w:pStyle w:val="Bibliography"/>
@@ -9361,7 +9389,7 @@
       <w:r>
         <w:t xml:space="preserve"> </w:t>
       </w:r>
-      <w:hyperlink r:id="rId283">
+      <w:hyperlink r:id="rId285">
         <w:r>
           <w:rPr>
             <w:rStyle w:val="Hyperlink"/>
@@ -9373,8 +9401,8 @@
         <w:t xml:space="preserve">.</w:t>
       </w:r>
     </w:p>
-    <w:bookmarkEnd w:id="284"/>
-    <w:bookmarkStart w:id="286" w:name="ref-Hill_Wood_Baggio_Hurtado_Boyd_2014"/>
+    <w:bookmarkEnd w:id="286"/>
+    <w:bookmarkStart w:id="288" w:name="ref-Hill_Wood_Baggio_Hurtado_Boyd_2014"/>
     <w:p>
       <w:pPr>
         <w:pStyle w:val="Bibliography"/>
@@ -9394,7 +9422,7 @@
       <w:r>
         <w:t xml:space="preserve"> </w:t>
       </w:r>
-      <w:hyperlink r:id="rId285">
+      <w:hyperlink r:id="rId287">
         <w:r>
           <w:rPr>
             <w:rStyle w:val="Hyperlink"/>
@@ -9406,8 +9434,8 @@
         <w:t xml:space="preserve">.</w:t>
       </w:r>
     </w:p>
-    <w:bookmarkEnd w:id="286"/>
-    <w:bookmarkStart w:id="288" w:name="ref-Derex_Boyd_2016"/>
+    <w:bookmarkEnd w:id="288"/>
+    <w:bookmarkStart w:id="290" w:name="ref-Derex_Boyd_2016"/>
     <w:p>
       <w:pPr>
         <w:pStyle w:val="Bibliography"/>
@@ -9427,7 +9455,7 @@
       <w:r>
         <w:t xml:space="preserve"> </w:t>
       </w:r>
-      <w:hyperlink r:id="rId287">
+      <w:hyperlink r:id="rId289">
         <w:r>
           <w:rPr>
             <w:rStyle w:val="Hyperlink"/>
@@ -9439,8 +9467,8 @@
         <w:t xml:space="preserve">.</w:t>
       </w:r>
     </w:p>
-    <w:bookmarkEnd w:id="288"/>
-    <w:bookmarkStart w:id="289" w:name="ref-Von_Petzinger_2009"/>
+    <w:bookmarkEnd w:id="290"/>
+    <w:bookmarkStart w:id="291" w:name="ref-Von_Petzinger_2009"/>
     <w:p>
       <w:pPr>
         <w:pStyle w:val="Bibliography"/>
@@ -9476,8 +9504,8 @@
         <w:t xml:space="preserve">parietal art. Master’s thesis. University of Victoria, 2009.</w:t>
       </w:r>
     </w:p>
-    <w:bookmarkEnd w:id="289"/>
-    <w:bookmarkStart w:id="291" w:name="ref-Herskind2023"/>
+    <w:bookmarkEnd w:id="291"/>
+    <w:bookmarkStart w:id="293" w:name="ref-Herskind2023"/>
     <w:p>
       <w:pPr>
         <w:pStyle w:val="Bibliography"/>
@@ -9497,7 +9525,7 @@
       <w:r>
         <w:t xml:space="preserve"> </w:t>
       </w:r>
-      <w:hyperlink r:id="rId290">
+      <w:hyperlink r:id="rId292">
         <w:r>
           <w:rPr>
             <w:rStyle w:val="Hyperlink"/>
@@ -9509,8 +9537,8 @@
         <w:t xml:space="preserve">.</w:t>
       </w:r>
     </w:p>
-    <w:bookmarkEnd w:id="291"/>
-    <w:bookmarkStart w:id="293" w:name="ref-Gravel-Miguel_Coward_2023"/>
+    <w:bookmarkEnd w:id="293"/>
+    <w:bookmarkStart w:id="295" w:name="ref-Gravel-Miguel_Coward_2023"/>
     <w:p>
       <w:pPr>
         <w:pStyle w:val="Bibliography"/>
@@ -9542,7 +9570,7 @@
       <w:r>
         <w:t xml:space="preserve"> </w:t>
       </w:r>
-      <w:hyperlink r:id="rId292">
+      <w:hyperlink r:id="rId294">
         <w:r>
           <w:rPr>
             <w:rStyle w:val="Hyperlink"/>
@@ -9554,8 +9582,8 @@
         <w:t xml:space="preserve">.</w:t>
       </w:r>
     </w:p>
-    <w:bookmarkEnd w:id="293"/>
-    <w:bookmarkStart w:id="295" w:name="X42e36537dda68556aeacf852410efd6ac3bb1ca"/>
+    <w:bookmarkEnd w:id="295"/>
+    <w:bookmarkStart w:id="297" w:name="X42e36537dda68556aeacf852410efd6ac3bb1ca"/>
     <w:p>
       <w:pPr>
         <w:pStyle w:val="Bibliography"/>
@@ -9575,7 +9603,7 @@
       <w:r>
         <w:t xml:space="preserve"> </w:t>
       </w:r>
-      <w:hyperlink r:id="rId294">
+      <w:hyperlink r:id="rId296">
         <w:r>
           <w:rPr>
             <w:rStyle w:val="Hyperlink"/>
@@ -9587,8 +9615,8 @@
         <w:t xml:space="preserve">.</w:t>
       </w:r>
     </w:p>
-    <w:bookmarkEnd w:id="295"/>
-    <w:bookmarkStart w:id="297" w:name="ref-Chiotti_2005"/>
+    <w:bookmarkEnd w:id="297"/>
+    <w:bookmarkStart w:id="299" w:name="ref-Chiotti_2005"/>
     <w:p>
       <w:pPr>
         <w:pStyle w:val="Bibliography"/>
@@ -9635,7 +9663,7 @@
       <w:r>
         <w:t xml:space="preserve"> </w:t>
       </w:r>
-      <w:hyperlink r:id="rId296">
+      <w:hyperlink r:id="rId298">
         <w:r>
           <w:rPr>
             <w:rStyle w:val="Hyperlink"/>
@@ -9647,8 +9675,8 @@
         <w:t xml:space="preserve">.</w:t>
       </w:r>
     </w:p>
-    <w:bookmarkEnd w:id="297"/>
-    <w:bookmarkStart w:id="299" w:name="ref-Higham_Abri_Pataud_2011"/>
+    <w:bookmarkEnd w:id="299"/>
+    <w:bookmarkStart w:id="301" w:name="ref-Higham_Abri_Pataud_2011"/>
     <w:p>
       <w:pPr>
         <w:pStyle w:val="Bibliography"/>
@@ -9707,7 +9735,7 @@
       <w:r>
         <w:t xml:space="preserve"> </w:t>
       </w:r>
-      <w:hyperlink r:id="rId298">
+      <w:hyperlink r:id="rId300">
         <w:r>
           <w:rPr>
             <w:rStyle w:val="Hyperlink"/>
@@ -9719,8 +9747,8 @@
         <w:t xml:space="preserve">.</w:t>
       </w:r>
     </w:p>
-    <w:bookmarkEnd w:id="299"/>
-    <w:bookmarkStart w:id="301" w:name="ref-Talamo_La_Ferrassie_2020"/>
+    <w:bookmarkEnd w:id="301"/>
+    <w:bookmarkStart w:id="303" w:name="ref-Talamo_La_Ferrassie_2020"/>
     <w:p>
       <w:pPr>
         <w:pStyle w:val="Bibliography"/>
@@ -9821,7 +9849,7 @@
       <w:r>
         <w:t xml:space="preserve"> </w:t>
       </w:r>
-      <w:hyperlink r:id="rId300">
+      <w:hyperlink r:id="rId302">
         <w:r>
           <w:rPr>
             <w:rStyle w:val="Hyperlink"/>
@@ -9833,8 +9861,8 @@
         <w:t xml:space="preserve">.</w:t>
       </w:r>
     </w:p>
-    <w:bookmarkEnd w:id="301"/>
-    <w:bookmarkStart w:id="303" w:name="ref-Wild_et_al_2005"/>
+    <w:bookmarkEnd w:id="303"/>
+    <w:bookmarkStart w:id="305" w:name="ref-Wild_et_al_2005"/>
     <w:p>
       <w:pPr>
         <w:pStyle w:val="Bibliography"/>
@@ -9890,7 +9918,7 @@
       <w:r>
         <w:t xml:space="preserve"> </w:t>
       </w:r>
-      <w:hyperlink r:id="rId302">
+      <w:hyperlink r:id="rId304">
         <w:r>
           <w:rPr>
             <w:rStyle w:val="Hyperlink"/>
@@ -9902,8 +9930,8 @@
         <w:t xml:space="preserve">.</w:t>
       </w:r>
     </w:p>
-    <w:bookmarkEnd w:id="303"/>
-    <w:bookmarkStart w:id="305" w:name="ref-Schurch_Conard_2026_reassess"/>
+    <w:bookmarkEnd w:id="305"/>
+    <w:bookmarkStart w:id="307" w:name="ref-Schurch_Conard_2026_reassess"/>
     <w:p>
       <w:pPr>
         <w:pStyle w:val="Bibliography"/>
@@ -9938,7 +9966,7 @@
       <w:r>
         <w:t xml:space="preserve"> </w:t>
       </w:r>
-      <w:hyperlink r:id="rId304">
+      <w:hyperlink r:id="rId306">
         <w:r>
           <w:rPr>
             <w:rStyle w:val="Hyperlink"/>
@@ -9950,9 +9978,9 @@
         <w:t xml:space="preserve">.</w:t>
       </w:r>
     </w:p>
-    <w:bookmarkEnd w:id="305"/>
-    <w:bookmarkEnd w:id="306"/>
     <w:bookmarkEnd w:id="307"/>
+    <w:bookmarkEnd w:id="308"/>
+    <w:bookmarkEnd w:id="309"/>
     <w:sectPr>
       <w:footnotePr>
         <w:numRestart w:val="eachSect"/>

</xml_diff>

<commit_message>
checking cross-refs in S1
</commit_message>
<xml_diff>
--- a/paper/paper.docx
+++ b/paper/paper.docx
@@ -1258,7 +1258,7 @@
         <w:t xml:space="preserve">S1.8.2</w:t>
       </w:r>
       <w:r>
-        <w:t xml:space="preserve">). This reveals no candidate is significant, so the null Mantel does not identify any specific alternative process. A Mantel correlogram likewise did not detect spatial structure at any distance lag, and bootstrap confidence intervals on the Mantel R indicate the test is underpowered at these sample sizes, so the non-significant result is best read as a lack of evidence rather than evidence of absence (S1 §</w:t>
+        <w:t xml:space="preserve">). This reveals no candidate is significant, so the null Mantel does not identify any specific alternative process. A Mantel correlogram likewise did not detect spatial structure, except for one nominally significant long-range lag in Aur-P2, and bootstrap confidence intervals on the Mantel R indicate the test is underpowered at these sample sizes, so the result is best read as a lack of evidence rather than evidence of absence (S1 §</w:t>
       </w:r>
       <w:r>
         <w:t xml:space="preserve">S1.4.3</w:t>
@@ -2707,11 +2707,7 @@
         <w:t xml:space="preserve">), indicating the Aur-P1–Aur-P2 contrast cannot distinguish a difference in network scale from a difference in connectedness or community structure at these sample sizes (S1 §</w:t>
       </w:r>
       <w:r>
-        <w:rPr>
-          <w:bCs/>
-          <w:b/>
-        </w:rPr>
-        <w:t xml:space="preserve">?@sec-s-power</w:t>
+        <w:t xml:space="preserve">S1.13</w:t>
       </w:r>
       <w:r>
         <w:t xml:space="preserve">). An exploratory PerMANOVA returns a nominal separation of the restricted- and broad-range groups in Aur-P1 sign composition (R² = 0.196, p = 0.001) but not in Aur-P2 (R² = 0.223, p = 0.076), consistent with the smaller Aur-P2 sample. That said, our sensitivity analyses show that this result is best taken as a gradual axis of variation (S1 §</w:t>
@@ -3077,7 +3073,7 @@
               <w:pStyle w:val="ImageCaption"/>
             </w:pPr>
             <w:r>
-              <w:t xml:space="preserve">Figure 6: Observed geometric sign diversity at each site compared with expectations derived from randomised assemblages controlling for sample size. The blue expectation curve is the mean simulated diversity index per sample size. The red lines enclose a band that is the 95% confidence interval of the null distribution (no sites exceed this interval). Sites above the blue expectation curve have higher than average diversity, given their sample size. Site names are shown for sites with a sample size of five or more; ten Aur-P1 sites and four Aur-P2 sites fall below that threshold and are drawn as unlabelled points, because their names cannot be placed legibly at this figure width. Per-site values for every site are given in S1 §</w:t>
+              <w:t xml:space="preserve">Figure 6: Observed geometric sign diversity at each site compared with expectations derived from randomised assemblages controlling for sample size. The blue expectation curve is the mean simulated diversity index per sample size. The red lines enclose a band that is the 95% confidence interval of the null distribution (no sites exceed this interval). Sites above the blue expectation curve have higher than average diversity, given their sample size. Site names are shown for sites with a sample size of three or more to avoid label overlap. Per-site values for every site are given in S1 §</w:t>
             </w:r>
             <w:r>
               <w:t xml:space="preserve">S1.12.2</w:t>
@@ -3499,7 +3495,13 @@
         <w:t xml:space="preserve">[102]</w:t>
       </w:r>
       <w:r>
-        <w:t xml:space="preserve">. Our finding of no statistically significant differences in connectivity metrics across the two phases suggests that relative interaction levels remained consistent over time, even as populations consolidated into fewer sites. However the low power of our analysis (S1 §S1.13) means this remains a hypothesis. This maintenance of interaction level through demographic consolidation parallels the Iberian Mesolithic, where peninsular-scale ornament networks persisted without topological change from the Early to Late Mesolithic despite population growth and technocomplex replacement</w:t>
+        <w:t xml:space="preserve">. Our finding of no statistically significant differences in connectivity metrics across the two phases suggests that relative interaction levels remained consistent over time, even as populations consolidated into fewer sites. However the low power of our analysis (S1 §</w:t>
+      </w:r>
+      <w:r>
+        <w:t xml:space="preserve">S1.13</w:t>
+      </w:r>
+      <w:r>
+        <w:t xml:space="preserve">) means this remains a hypothesis. This maintenance of interaction level through demographic consolidation parallels the Iberian Mesolithic, where peninsular-scale ornament networks persisted without topological change from the Early to Late Mesolithic despite population growth and technocomplex replacement</w:t>
       </w:r>
       <w:r>
         <w:t xml:space="preserve"> </w:t>
@@ -3860,7 +3862,7 @@
         <w:t xml:space="preserve">). Alternative calibrations move a few boundary sites between phases without changing the phase ordering (S1 §</w:t>
       </w:r>
       <w:r>
-        <w:t xml:space="preserve">S1.5.3</w:t>
+        <w:t xml:space="preserve">S1.5.4</w:t>
       </w:r>
       <w:r>
         <w:t xml:space="preserve">).</w:t>

</xml_diff>

<commit_message>
update table col widths, remove duplicate cols
</commit_message>
<xml_diff>
--- a/paper/paper.docx
+++ b/paper/paper.docx
@@ -688,10 +688,10 @@
               <w:tblLayout w:type="fixed"/>
             </w:tblPr>
             <w:tblGrid>
-              <w:gridCol w:w="205"/>
-              <w:gridCol w:w="168"/>
-              <w:gridCol w:w="6928"/>
-              <w:gridCol w:w="617"/>
+              <w:gridCol w:w="1425"/>
+              <w:gridCol w:w="1267"/>
+              <w:gridCol w:w="3168"/>
+              <w:gridCol w:w="2059"/>
             </w:tblGrid>
             <w:tr>
               <w:trPr>
@@ -703,7 +703,7 @@
                   <w:pPr>
                     <w:pStyle w:val="Compact"/>
                     <w:jc w:val="left"/>
-                    <w:jc w:val="center"/>
+                    <w:jc w:val="left"/>
                   </w:pPr>
                   <w:r>
                     <w:t xml:space="preserve">Time Period Name</w:t>
@@ -716,7 +716,7 @@
                   <w:pPr>
                     <w:pStyle w:val="Compact"/>
                     <w:jc w:val="left"/>
-                    <w:jc w:val="center"/>
+                    <w:jc w:val="left"/>
                   </w:pPr>
                   <w:r>
                     <w:t xml:space="preserve">Dates (ka cal BP)</w:t>
@@ -729,7 +729,7 @@
                   <w:pPr>
                     <w:pStyle w:val="Compact"/>
                     <w:jc w:val="left"/>
-                    <w:jc w:val="center"/>
+                    <w:jc w:val="left"/>
                   </w:pPr>
                   <w:r>
                     <w:t xml:space="preserve">Material Culture Markers</w:t>
@@ -742,7 +742,7 @@
                   <w:pPr>
                     <w:pStyle w:val="Compact"/>
                     <w:jc w:val="left"/>
-                    <w:jc w:val="center"/>
+                    <w:jc w:val="left"/>
                   </w:pPr>
                   <w:r>
                     <w:t xml:space="preserve">Environmental Context</w:t>
@@ -757,7 +757,7 @@
                   <w:pPr>
                     <w:pStyle w:val="Compact"/>
                     <w:jc w:val="left"/>
-                    <w:jc w:val="center"/>
+                    <w:jc w:val="left"/>
                   </w:pPr>
                   <w:r>
                     <w:t xml:space="preserve">Aur-P1 (Proto/Early)</w:t>
@@ -770,7 +770,7 @@
                   <w:pPr>
                     <w:pStyle w:val="Compact"/>
                     <w:jc w:val="left"/>
-                    <w:jc w:val="center"/>
+                    <w:jc w:val="left"/>
                   </w:pPr>
                   <w:r>
                     <w:t xml:space="preserve">43 - 37</w:t>
@@ -783,7 +783,7 @@
                   <w:pPr>
                     <w:pStyle w:val="Compact"/>
                     <w:jc w:val="left"/>
-                    <w:jc w:val="center"/>
+                    <w:jc w:val="left"/>
                   </w:pPr>
                   <w:r>
                     <w:t xml:space="preserve">Blades and bladelets initially produced within a single, continuous reduction sequence from the same unipolar/prismatic core, rather than from separate blade and bladelet cores; bladelets are the main target, large, straight-profiled, and turned into Dufour bladelets of the Dufour subtype via marginal direct, inverse or alternate retouch; split-based bone/antler points are initially very rare, then regionally variable. Blade and bladelet production later run as separate reduction sequences, with carinated and nosed end-scrapers systematically used as bladelet cores; thick blades with invasive, scalar Aurignacian retouch, sometimes waisted/strangled; Dufour bladelets later include the smaller Roc-de-Combe subtype alongside Dufour.</w:t>
@@ -796,7 +796,7 @@
                   <w:pPr>
                     <w:pStyle w:val="Compact"/>
                     <w:jc w:val="left"/>
-                    <w:jc w:val="center"/>
+                    <w:jc w:val="left"/>
                   </w:pPr>
                   <w:r>
                     <w:t xml:space="preserve">Starts at Greenland Stadial 12, ends at Greenland Interstadial 8</w:t>
@@ -811,7 +811,7 @@
                   <w:pPr>
                     <w:pStyle w:val="Compact"/>
                     <w:jc w:val="left"/>
-                    <w:jc w:val="center"/>
+                    <w:jc w:val="left"/>
                   </w:pPr>
                   <w:r>
                     <w:t xml:space="preserve">Aur-P2 (Evolved/Late)</w:t>
@@ -824,7 +824,7 @@
                   <w:pPr>
                     <w:pStyle w:val="Compact"/>
                     <w:jc w:val="left"/>
-                    <w:jc w:val="center"/>
+                    <w:jc w:val="left"/>
                   </w:pPr>
                   <w:r>
                     <w:t xml:space="preserve">37 - 32</w:t>
@@ -837,7 +837,7 @@
                   <w:pPr>
                     <w:pStyle w:val="Compact"/>
                     <w:jc w:val="left"/>
-                    <w:jc w:val="center"/>
+                    <w:jc w:val="left"/>
                   </w:pPr>
                   <w:r>
                     <w:t xml:space="preserve">Carinated/nosed-scraper bladelet-core technology intensifies further; busked (busqué) burins become numerous, later joined/replaced by the closely related Vachons-type burin; Dufour bladelets now dominated by the smaller, twisted Roc-de-Combe subtype; split-based points become rare, replaced first by flattened lozenge-shaped bone/antler points (with the busked burins), then oval-sectioned lozenge points (with Vachons burins), and finally biconical points</w:t>
@@ -850,7 +850,7 @@
                   <w:pPr>
                     <w:pStyle w:val="Compact"/>
                     <w:jc w:val="left"/>
-                    <w:jc w:val="center"/>
+                    <w:jc w:val="left"/>
                   </w:pPr>
                   <w:r>
                     <w:t xml:space="preserve">GI 8 - 6</w:t>
@@ -861,7 +861,7 @@
           </w:tbl>
           <w:p>
             <w:pPr>
-              <w:jc w:val="center"/>
+              <w:jc w:val="left"/>
             </w:pPr>
             <w:pPr>
               <w:jc w:val="start"/>
@@ -994,7 +994,7 @@
           <w:p>
             <w:pPr>
               <w:pStyle w:val="Compact"/>
-              <w:jc w:val="center"/>
+              <w:jc w:val="left"/>
             </w:pPr>
             <w:r>
               <w:drawing>
@@ -1041,7 +1041,7 @@
           </w:p>
           <w:p>
             <w:pPr>
-              <w:jc w:val="center"/>
+              <w:jc w:val="left"/>
             </w:pPr>
             <w:pPr>
               <w:jc w:val="start"/>
@@ -1303,15 +1303,16 @@
           <w:tbl>
             <w:tblPr>
               <w:tblStyle w:val="Table"/>
-              <w:tblW w:type="auto" w:w="0"/>
+              <w:tblW w:type="pct" w:w="5000"/>
               <w:tblLook w:firstRow="1" w:lastRow="0" w:firstColumn="0" w:lastColumn="0" w:noHBand="0" w:noVBand="0" w:val="0020"/>
               <w:jc w:val="start"/>
+              <w:tblLayout w:type="fixed"/>
             </w:tblPr>
             <w:tblGrid>
-              <w:gridCol w:w="1980"/>
-              <w:gridCol w:w="1980"/>
-              <w:gridCol w:w="1980"/>
-              <w:gridCol w:w="1980"/>
+              <w:gridCol w:w="2376"/>
+              <w:gridCol w:w="1584"/>
+              <w:gridCol w:w="1425"/>
+              <w:gridCol w:w="2534"/>
             </w:tblGrid>
             <w:tr>
               <w:trPr>
@@ -1323,7 +1324,7 @@
                   <w:pPr>
                     <w:pStyle w:val="Compact"/>
                     <w:jc w:val="left"/>
-                    <w:jc w:val="center"/>
+                    <w:jc w:val="left"/>
                   </w:pPr>
                   <w:r>
                     <w:t xml:space="preserve">Aurignacian phase</w:t>
@@ -1335,8 +1336,8 @@
                 <w:p>
                   <w:pPr>
                     <w:pStyle w:val="Compact"/>
-                    <w:jc w:val="right"/>
-                    <w:jc w:val="center"/>
+                    <w:jc w:val="left"/>
+                    <w:jc w:val="left"/>
                   </w:pPr>
                   <w:r>
                     <w:t xml:space="preserve">Mantel R</w:t>
@@ -1348,8 +1349,8 @@
                 <w:p>
                   <w:pPr>
                     <w:pStyle w:val="Compact"/>
-                    <w:jc w:val="right"/>
-                    <w:jc w:val="center"/>
+                    <w:jc w:val="left"/>
+                    <w:jc w:val="left"/>
                   </w:pPr>
                   <w:r>
                     <w:t xml:space="preserve">Mantel p</w:t>
@@ -1362,7 +1363,7 @@
                   <w:pPr>
                     <w:pStyle w:val="Compact"/>
                     <w:jc w:val="left"/>
-                    <w:jc w:val="center"/>
+                    <w:jc w:val="left"/>
                   </w:pPr>
                   <w:r>
                     <w:t xml:space="preserve">Mantel 95% CI</w:t>
@@ -1377,7 +1378,7 @@
                   <w:pPr>
                     <w:pStyle w:val="Compact"/>
                     <w:jc w:val="left"/>
-                    <w:jc w:val="center"/>
+                    <w:jc w:val="left"/>
                   </w:pPr>
                   <w:r>
                     <w:t xml:space="preserve">Aur-P1</w:t>
@@ -1389,8 +1390,8 @@
                 <w:p>
                   <w:pPr>
                     <w:pStyle w:val="Compact"/>
-                    <w:jc w:val="right"/>
-                    <w:jc w:val="center"/>
+                    <w:jc w:val="left"/>
+                    <w:jc w:val="left"/>
                   </w:pPr>
                   <w:r>
                     <w:t xml:space="preserve">0.046</w:t>
@@ -1402,8 +1403,8 @@
                 <w:p>
                   <w:pPr>
                     <w:pStyle w:val="Compact"/>
-                    <w:jc w:val="right"/>
-                    <w:jc w:val="center"/>
+                    <w:jc w:val="left"/>
+                    <w:jc w:val="left"/>
                   </w:pPr>
                   <w:r>
                     <w:t xml:space="preserve">0.301</w:t>
@@ -1416,7 +1417,7 @@
                   <w:pPr>
                     <w:pStyle w:val="Compact"/>
                     <w:jc w:val="left"/>
-                    <w:jc w:val="center"/>
+                    <w:jc w:val="left"/>
                   </w:pPr>
                   <w:r>
                     <w:t xml:space="preserve">[-0.022, 0.086]</w:t>
@@ -1431,7 +1432,7 @@
                   <w:pPr>
                     <w:pStyle w:val="Compact"/>
                     <w:jc w:val="left"/>
-                    <w:jc w:val="center"/>
+                    <w:jc w:val="left"/>
                   </w:pPr>
                   <w:r>
                     <w:t xml:space="preserve">Aur-P2</w:t>
@@ -1443,8 +1444,8 @@
                 <w:p>
                   <w:pPr>
                     <w:pStyle w:val="Compact"/>
-                    <w:jc w:val="right"/>
-                    <w:jc w:val="center"/>
+                    <w:jc w:val="left"/>
+                    <w:jc w:val="left"/>
                   </w:pPr>
                   <w:r>
                     <w:t xml:space="preserve">-0.299</w:t>
@@ -1456,8 +1457,8 @@
                 <w:p>
                   <w:pPr>
                     <w:pStyle w:val="Compact"/>
-                    <w:jc w:val="right"/>
-                    <w:jc w:val="center"/>
+                    <w:jc w:val="left"/>
+                    <w:jc w:val="left"/>
                   </w:pPr>
                   <w:r>
                     <w:t xml:space="preserve">0.933</w:t>
@@ -1470,7 +1471,7 @@
                   <w:pPr>
                     <w:pStyle w:val="Compact"/>
                     <w:jc w:val="left"/>
-                    <w:jc w:val="center"/>
+                    <w:jc w:val="left"/>
                   </w:pPr>
                   <w:r>
                     <w:t xml:space="preserve">[-0.355, -0.231]</w:t>
@@ -1481,7 +1482,7 @@
           </w:tbl>
           <w:p>
             <w:pPr>
-              <w:jc w:val="center"/>
+              <w:jc w:val="left"/>
             </w:pPr>
             <w:pPr>
               <w:jc w:val="start"/>
@@ -1801,7 +1802,7 @@
           <w:p>
             <w:pPr>
               <w:pStyle w:val="Compact"/>
-              <w:jc w:val="center"/>
+              <w:jc w:val="left"/>
             </w:pPr>
             <w:r>
               <w:drawing>
@@ -1848,7 +1849,7 @@
           </w:p>
           <w:p>
             <w:pPr>
-              <w:jc w:val="center"/>
+              <w:jc w:val="left"/>
             </w:pPr>
             <w:pPr>
               <w:jc w:val="start"/>
@@ -1960,7 +1961,7 @@
           <w:p>
             <w:pPr>
               <w:pStyle w:val="Compact"/>
-              <w:jc w:val="center"/>
+              <w:jc w:val="left"/>
             </w:pPr>
             <w:r>
               <w:drawing>
@@ -2007,7 +2008,7 @@
           </w:p>
           <w:p>
             <w:pPr>
-              <w:jc w:val="center"/>
+              <w:jc w:val="left"/>
             </w:pPr>
             <w:pPr>
               <w:jc w:val="start"/>
@@ -2040,7 +2041,7 @@
           <w:p>
             <w:pPr>
               <w:pStyle w:val="Compact"/>
-              <w:jc w:val="center"/>
+              <w:jc w:val="left"/>
             </w:pPr>
             <w:r>
               <w:drawing>
@@ -2087,7 +2088,7 @@
           </w:p>
           <w:p>
             <w:pPr>
-              <w:jc w:val="center"/>
+              <w:jc w:val="left"/>
             </w:pPr>
             <w:pPr>
               <w:jc w:val="start"/>
@@ -2200,7 +2201,7 @@
           <w:p>
             <w:pPr>
               <w:pStyle w:val="Compact"/>
-              <w:jc w:val="center"/>
+              <w:jc w:val="left"/>
             </w:pPr>
             <w:r>
               <w:drawing>
@@ -2247,7 +2248,7 @@
           </w:p>
           <w:p>
             <w:pPr>
-              <w:jc w:val="center"/>
+              <w:jc w:val="left"/>
             </w:pPr>
             <w:pPr>
               <w:jc w:val="start"/>
@@ -2327,11 +2328,11 @@
               <w:tblLayout w:type="fixed"/>
             </w:tblPr>
             <w:tblGrid>
-              <w:gridCol w:w="1900"/>
-              <w:gridCol w:w="1372"/>
+              <w:gridCol w:w="2059"/>
+              <w:gridCol w:w="1425"/>
               <w:gridCol w:w="1267"/>
               <w:gridCol w:w="1267"/>
-              <w:gridCol w:w="2112"/>
+              <w:gridCol w:w="1900"/>
             </w:tblGrid>
             <w:tr>
               <w:trPr>
@@ -2343,7 +2344,7 @@
                   <w:pPr>
                     <w:pStyle w:val="Compact"/>
                     <w:jc w:val="left"/>
-                    <w:jc w:val="center"/>
+                    <w:jc w:val="left"/>
                   </w:pPr>
                   <w:r>
                     <w:t xml:space="preserve">Aurignacian phase</w:t>
@@ -2355,8 +2356,8 @@
                 <w:p>
                   <w:pPr>
                     <w:pStyle w:val="Compact"/>
-                    <w:jc w:val="right"/>
-                    <w:jc w:val="center"/>
+                    <w:jc w:val="left"/>
+                    <w:jc w:val="left"/>
                   </w:pPr>
                   <w:r>
                     <w:t xml:space="preserve">PerMANOVA R2</w:t>
@@ -2368,8 +2369,8 @@
                 <w:p>
                   <w:pPr>
                     <w:pStyle w:val="Compact"/>
-                    <w:jc w:val="right"/>
-                    <w:jc w:val="center"/>
+                    <w:jc w:val="left"/>
+                    <w:jc w:val="left"/>
                   </w:pPr>
                   <w:r>
                     <w:t xml:space="preserve">PerMANOVA F</w:t>
@@ -2381,8 +2382,8 @@
                 <w:p>
                   <w:pPr>
                     <w:pStyle w:val="Compact"/>
-                    <w:jc w:val="right"/>
-                    <w:jc w:val="center"/>
+                    <w:jc w:val="left"/>
+                    <w:jc w:val="left"/>
                   </w:pPr>
                   <w:r>
                     <w:t xml:space="preserve">PerMANOVA p</w:t>
@@ -2395,7 +2396,7 @@
                   <w:pPr>
                     <w:pStyle w:val="Compact"/>
                     <w:jc w:val="left"/>
-                    <w:jc w:val="center"/>
+                    <w:jc w:val="left"/>
                   </w:pPr>
                   <w:r>
                     <w:t xml:space="preserve">PerMANOVA R2 95% CI</w:t>
@@ -2410,7 +2411,7 @@
                   <w:pPr>
                     <w:pStyle w:val="Compact"/>
                     <w:jc w:val="left"/>
-                    <w:jc w:val="center"/>
+                    <w:jc w:val="left"/>
                   </w:pPr>
                   <w:r>
                     <w:t xml:space="preserve">Aur-P1</w:t>
@@ -2422,8 +2423,8 @@
                 <w:p>
                   <w:pPr>
                     <w:pStyle w:val="Compact"/>
-                    <w:jc w:val="right"/>
-                    <w:jc w:val="center"/>
+                    <w:jc w:val="left"/>
+                    <w:jc w:val="left"/>
                   </w:pPr>
                   <w:r>
                     <w:t xml:space="preserve">0.196</w:t>
@@ -2435,8 +2436,8 @@
                 <w:p>
                   <w:pPr>
                     <w:pStyle w:val="Compact"/>
-                    <w:jc w:val="right"/>
-                    <w:jc w:val="center"/>
+                    <w:jc w:val="left"/>
+                    <w:jc w:val="left"/>
                   </w:pPr>
                   <w:r>
                     <w:t xml:space="preserve">4.382</w:t>
@@ -2448,8 +2449,8 @@
                 <w:p>
                   <w:pPr>
                     <w:pStyle w:val="Compact"/>
-                    <w:jc w:val="right"/>
-                    <w:jc w:val="center"/>
+                    <w:jc w:val="left"/>
+                    <w:jc w:val="left"/>
                   </w:pPr>
                   <w:r>
                     <w:t xml:space="preserve">0.001</w:t>
@@ -2462,7 +2463,7 @@
                   <w:pPr>
                     <w:pStyle w:val="Compact"/>
                     <w:jc w:val="left"/>
-                    <w:jc w:val="center"/>
+                    <w:jc w:val="left"/>
                   </w:pPr>
                   <w:r>
                     <w:t xml:space="preserve">[0.145, 0.206]</w:t>
@@ -2477,7 +2478,7 @@
                   <w:pPr>
                     <w:pStyle w:val="Compact"/>
                     <w:jc w:val="left"/>
-                    <w:jc w:val="center"/>
+                    <w:jc w:val="left"/>
                   </w:pPr>
                   <w:r>
                     <w:t xml:space="preserve">Aur-P2</w:t>
@@ -2489,8 +2490,8 @@
                 <w:p>
                   <w:pPr>
                     <w:pStyle w:val="Compact"/>
-                    <w:jc w:val="right"/>
-                    <w:jc w:val="center"/>
+                    <w:jc w:val="left"/>
+                    <w:jc w:val="left"/>
                   </w:pPr>
                   <w:r>
                     <w:t xml:space="preserve">0.223</w:t>
@@ -2502,8 +2503,8 @@
                 <w:p>
                   <w:pPr>
                     <w:pStyle w:val="Compact"/>
-                    <w:jc w:val="right"/>
-                    <w:jc w:val="center"/>
+                    <w:jc w:val="left"/>
+                    <w:jc w:val="left"/>
                   </w:pPr>
                   <w:r>
                     <w:t xml:space="preserve">2.008</w:t>
@@ -2515,8 +2516,8 @@
                 <w:p>
                   <w:pPr>
                     <w:pStyle w:val="Compact"/>
-                    <w:jc w:val="right"/>
-                    <w:jc w:val="center"/>
+                    <w:jc w:val="left"/>
+                    <w:jc w:val="left"/>
                   </w:pPr>
                   <w:r>
                     <w:t xml:space="preserve">0.076</w:t>
@@ -2529,7 +2530,7 @@
                   <w:pPr>
                     <w:pStyle w:val="Compact"/>
                     <w:jc w:val="left"/>
-                    <w:jc w:val="center"/>
+                    <w:jc w:val="left"/>
                   </w:pPr>
                   <w:r>
                     <w:t xml:space="preserve">[0.132, 0.229]</w:t>
@@ -2540,7 +2541,7 @@
           </w:tbl>
           <w:p>
             <w:pPr>
-              <w:jc w:val="center"/>
+              <w:jc w:val="left"/>
             </w:pPr>
             <w:pPr>
               <w:jc w:val="start"/>
@@ -3018,7 +3019,7 @@
           <w:p>
             <w:pPr>
               <w:pStyle w:val="Compact"/>
-              <w:jc w:val="center"/>
+              <w:jc w:val="left"/>
             </w:pPr>
             <w:r>
               <w:drawing>
@@ -3065,7 +3066,7 @@
           </w:p>
           <w:p>
             <w:pPr>
-              <w:jc w:val="center"/>
+              <w:jc w:val="left"/>
             </w:pPr>
             <w:pPr>
               <w:jc w:val="start"/>

</xml_diff>

<commit_message>
change plot colouring so it's color blind safe
</commit_message>
<xml_diff>
--- a/paper/paper.docx
+++ b/paper/paper.docx
@@ -1903,7 +1903,7 @@
               <w:pStyle w:val="ImageCaption"/>
             </w:pPr>
             <w:r>
-              <w:t xml:space="preserve">Figure 2: Presence–absence matrices of geometric sign types reordered using Brower‑Kile seriation for (A) Aur-P1 and (B) Aur-P2 phases. Rows represent sites and columns represent sign types. Hypothesized site grouping indicated by colour: restricted group is in red, broader group is in blue.</w:t>
+              <w:t xml:space="preserve">Figure 2: Presence–absence matrices of geometric sign types reordered using Brower‑Kile seriation for (A) Aur-P1 and (B) Aur-P2 phases. Rows represent sites and columns represent sign types. Hypothesized site grouping indicated by colour: restricted group is in orange, broader group is in blue.</w:t>
             </w:r>
           </w:p>
           <w:bookmarkEnd w:id="37"/>
@@ -3944,7 +3944,13 @@
         <w:t xml:space="preserve">S1.5.3</w:t>
       </w:r>
       <w:r>
-        <w:t xml:space="preserve">). We did not repeat the network analyses with these alternative date ends. Shifting the phase boundary by up to 1,000 years moves at most a few sites and does not change the raw mean-degree ordering of the phases (S1 §</w:t>
+        <w:t xml:space="preserve">). When we repeat the full network analysis with each date end, the phase that holds more sites has the higher raw mean degree: Aur-P1 under the older end and the midpoint, and Aur-P2 under the younger end (S1 §</w:t>
+      </w:r>
+      <w:r>
+        <w:t xml:space="preserve">S1.5.3</w:t>
+      </w:r>
+      <w:r>
+        <w:t xml:space="preserve">). This dependence supports reading the raw between-phase contrast as an effect of network size, not of connectivity. Shifting the phase boundary by up to 1,000 years moves at most a few sites and does not change the raw mean-degree ordering of the phases (S1 §</w:t>
       </w:r>
       <w:r>
         <w:t xml:space="preserve">S1.5.4</w:t>

</xml_diff>